<commit_message>
fixed issues with GraphAxisSidereplaced overlay code for the background with a GUIStyle
</commit_message>
<xml_diff>
--- a/Manual/VesselPlanner-Stage-by-Stage-Tutorial.docx
+++ b/Manual/VesselPlanner-Stage-by-Stage-Tutorial.docx
@@ -19,7 +19,7 @@
         <w:jc w:val="center"/>
       </w:pPr>
       <w:r>
-        <w:t>KSP1 • VesselPlanner 0.6.30</w:t>
+        <w:t>KSP1 • VesselPlanner 0.6.33</w:t>
       </w:r>
     </w:p>
     <w:p>
@@ -2097,7 +2097,7 @@
         <w:color w:val="6E6E6E"/>
         <w:sz w:val="17"/>
       </w:rPr>
-      <w:t xml:space="preserve">VesselPlanner 0.6.30  |  Page </w:t>
+      <w:t xml:space="preserve">VesselPlanner 0.6.33  |  Page </w:t>
     </w:r>
     <w:r/>
   </w:p>

</xml_diff>